<commit_message>
word con imagenes de prueba
</commit_message>
<xml_diff>
--- a/DVVDS/T3.0/T3.0.docx
+++ b/DVVDS/T3.0/T3.0.docx
@@ -60,16 +60,8 @@
         <w:rPr>
           <w:lang w:val="es-MX" w:eastAsia="en-US"/>
         </w:rPr>
-        <w:t xml:space="preserve">BCD </w:t>
-      </w:r>
-      <w:proofErr w:type="spellStart"/>
-      <w:r>
-        <w:rPr>
-          <w:lang w:val="es-MX" w:eastAsia="en-US"/>
-        </w:rPr>
-        <w:t>decoder</w:t>
-      </w:r>
-      <w:proofErr w:type="spellEnd"/>
+        <w:t>BCD decoder</w:t>
+      </w:r>
     </w:p>
     <w:p>
       <w:pPr>
@@ -87,7 +79,6 @@
       <w:r>
         <w:t xml:space="preserve"> </w:t>
       </w:r>
-      <w:proofErr w:type="spellStart"/>
       <w:r>
         <w:rPr>
           <w:color w:val="FFFFFF" w:themeColor="background1"/>
@@ -102,7 +93,6 @@
         </w:rPr>
         <w:t>ystemVerilog</w:t>
       </w:r>
-      <w:proofErr w:type="spellEnd"/>
       <w:r>
         <w:t>,</w:t>
       </w:r>
@@ -3387,7 +3377,6 @@
         </w:rPr>
         <w:t xml:space="preserve">    </w:t>
       </w:r>
-      <w:proofErr w:type="spellStart"/>
       <w:r>
         <w:rPr>
           <w:rFonts w:ascii="Consolas" w:hAnsi="Consolas"/>
@@ -3397,7 +3386,6 @@
         </w:rPr>
         <w:t>endcase</w:t>
       </w:r>
-      <w:proofErr w:type="spellEnd"/>
     </w:p>
     <w:p>
       <w:pPr>
@@ -3430,7 +3418,6 @@
           <w:lang w:eastAsia="en-US"/>
         </w:rPr>
       </w:pPr>
-      <w:proofErr w:type="spellStart"/>
       <w:r>
         <w:rPr>
           <w:rFonts w:ascii="Arial" w:hAnsi="Arial" w:cs="Arial"/>
@@ -3438,51 +3425,13 @@
           <w:szCs w:val="20"/>
           <w:lang w:eastAsia="en-US"/>
         </w:rPr>
-        <w:t>Visualmente</w:t>
-      </w:r>
-      <w:proofErr w:type="spellEnd"/>
-      <w:r>
-        <w:rPr>
-          <w:rFonts w:ascii="Arial" w:hAnsi="Arial" w:cs="Arial"/>
-          <w:sz w:val="20"/>
-          <w:szCs w:val="20"/>
-          <w:lang w:eastAsia="en-US"/>
-        </w:rPr>
-        <w:t xml:space="preserve"> </w:t>
-      </w:r>
-      <w:proofErr w:type="spellStart"/>
-      <w:r>
-        <w:rPr>
-          <w:rFonts w:ascii="Arial" w:hAnsi="Arial" w:cs="Arial"/>
-          <w:sz w:val="20"/>
-          <w:szCs w:val="20"/>
-          <w:lang w:eastAsia="en-US"/>
-        </w:rPr>
-        <w:t>en</w:t>
-      </w:r>
-      <w:proofErr w:type="spellEnd"/>
-      <w:r>
-        <w:rPr>
-          <w:rFonts w:ascii="Arial" w:hAnsi="Arial" w:cs="Arial"/>
-          <w:sz w:val="20"/>
-          <w:szCs w:val="20"/>
-          <w:lang w:eastAsia="en-US"/>
-        </w:rPr>
-        <w:t xml:space="preserve"> 7 </w:t>
-      </w:r>
-      <w:proofErr w:type="spellStart"/>
-      <w:r>
-        <w:rPr>
-          <w:rFonts w:ascii="Arial" w:hAnsi="Arial" w:cs="Arial"/>
-          <w:sz w:val="20"/>
-          <w:szCs w:val="20"/>
-          <w:lang w:eastAsia="en-US"/>
-        </w:rPr>
-        <w:t>segmentos</w:t>
-      </w:r>
-      <w:proofErr w:type="spellEnd"/>
-    </w:p>
-    <w:p>
+        <w:t>Visualmente en 7 segmentos</w:t>
+      </w:r>
+    </w:p>
+    <w:p>
+      <w:pPr>
+        <w:jc w:val="center"/>
+      </w:pPr>
       <w:r>
         <w:drawing>
           <wp:inline distT="0" distB="0" distL="0" distR="0" wp14:anchorId="6688B490" wp14:editId="374CFB86">
@@ -3521,9 +3470,677 @@
         </w:drawing>
       </w:r>
     </w:p>
+    <w:p>
+      <w:r>
+        <w:t xml:space="preserve">PinPlnner: </w:t>
+      </w:r>
+    </w:p>
+    <w:p>
+      <w:pPr>
+        <w:jc w:val="center"/>
+      </w:pPr>
+      <w:r>
+        <w:drawing>
+          <wp:inline distT="0" distB="0" distL="0" distR="0" wp14:anchorId="12F99CAE" wp14:editId="547D68C0">
+            <wp:extent cx="3619500" cy="2020888"/>
+            <wp:effectExtent l="0" t="0" r="0" b="0"/>
+            <wp:docPr id="1083563167" name="Picture 1"/>
+            <wp:cNvGraphicFramePr>
+              <a:graphicFrameLocks xmlns:a="http://schemas.openxmlformats.org/drawingml/2006/main" noChangeAspect="1"/>
+            </wp:cNvGraphicFramePr>
+            <a:graphic xmlns:a="http://schemas.openxmlformats.org/drawingml/2006/main">
+              <a:graphicData uri="http://schemas.openxmlformats.org/drawingml/2006/picture">
+                <pic:pic xmlns:pic="http://schemas.openxmlformats.org/drawingml/2006/picture">
+                  <pic:nvPicPr>
+                    <pic:cNvPr id="1083563167" name=""/>
+                    <pic:cNvPicPr/>
+                  </pic:nvPicPr>
+                  <pic:blipFill>
+                    <a:blip r:embed="rId13"/>
+                    <a:stretch>
+                      <a:fillRect/>
+                    </a:stretch>
+                  </pic:blipFill>
+                  <pic:spPr>
+                    <a:xfrm>
+                      <a:off x="0" y="0"/>
+                      <a:ext cx="3621709" cy="2022121"/>
+                    </a:xfrm>
+                    <a:prstGeom prst="rect">
+                      <a:avLst/>
+                    </a:prstGeom>
+                  </pic:spPr>
+                </pic:pic>
+              </a:graphicData>
+            </a:graphic>
+          </wp:inline>
+        </w:drawing>
+      </w:r>
+    </w:p>
+    <w:p>
+      <w:pPr>
+        <w:jc w:val="center"/>
+      </w:pPr>
+    </w:p>
+    <w:p>
+      <w:pPr>
+        <w:jc w:val="center"/>
+      </w:pPr>
+      <w:r>
+        <w:lastRenderedPageBreak/>
+        <w:t>RTL VIEW:</w:t>
+      </w:r>
+    </w:p>
+    <w:p>
+      <w:pPr>
+        <w:jc w:val="center"/>
+      </w:pPr>
+    </w:p>
+    <w:p>
+      <w:pPr>
+        <w:jc w:val="center"/>
+      </w:pPr>
+    </w:p>
+    <w:p>
+      <w:pPr>
+        <w:jc w:val="center"/>
+      </w:pPr>
+      <w:r>
+        <w:drawing>
+          <wp:inline distT="0" distB="0" distL="0" distR="0" wp14:anchorId="7A5A147C" wp14:editId="6219BDC6">
+            <wp:extent cx="6581775" cy="3148465"/>
+            <wp:effectExtent l="0" t="0" r="0" b="0"/>
+            <wp:docPr id="1634474691" name="Picture 1"/>
+            <wp:cNvGraphicFramePr>
+              <a:graphicFrameLocks xmlns:a="http://schemas.openxmlformats.org/drawingml/2006/main" noChangeAspect="1"/>
+            </wp:cNvGraphicFramePr>
+            <a:graphic xmlns:a="http://schemas.openxmlformats.org/drawingml/2006/main">
+              <a:graphicData uri="http://schemas.openxmlformats.org/drawingml/2006/picture">
+                <pic:pic xmlns:pic="http://schemas.openxmlformats.org/drawingml/2006/picture">
+                  <pic:nvPicPr>
+                    <pic:cNvPr id="1634474691" name=""/>
+                    <pic:cNvPicPr/>
+                  </pic:nvPicPr>
+                  <pic:blipFill>
+                    <a:blip r:embed="rId14"/>
+                    <a:stretch>
+                      <a:fillRect/>
+                    </a:stretch>
+                  </pic:blipFill>
+                  <pic:spPr>
+                    <a:xfrm>
+                      <a:off x="0" y="0"/>
+                      <a:ext cx="6588864" cy="3151856"/>
+                    </a:xfrm>
+                    <a:prstGeom prst="rect">
+                      <a:avLst/>
+                    </a:prstGeom>
+                  </pic:spPr>
+                </pic:pic>
+              </a:graphicData>
+            </a:graphic>
+          </wp:inline>
+        </w:drawing>
+      </w:r>
+    </w:p>
+    <w:p>
+      <w:pPr>
+        <w:jc w:val="center"/>
+      </w:pPr>
+      <w:r>
+        <w:t xml:space="preserve">Pruebas: </w:t>
+      </w:r>
+    </w:p>
+    <w:p>
+      <w:pPr>
+        <w:jc w:val="center"/>
+      </w:pPr>
+      <w:r>
+        <w:tab/>
+      </w:r>
+    </w:p>
+    <w:p>
+      <w:pPr>
+        <w:jc w:val="both"/>
+      </w:pPr>
+      <w:r>
+        <w:tab/>
+        <w:t>parameter [7:0] bin = 8'd000</w:t>
+      </w:r>
+    </w:p>
+    <w:p>
+      <w:pPr>
+        <w:jc w:val="center"/>
+      </w:pPr>
+      <w:r>
+        <w:rPr>
+          <w:noProof/>
+        </w:rPr>
+        <mc:AlternateContent>
+          <mc:Choice Requires="wps">
+            <w:drawing>
+              <wp:inline distT="0" distB="0" distL="0" distR="0" wp14:anchorId="39DB0FF4" wp14:editId="2501242F">
+                <wp:extent cx="304800" cy="304800"/>
+                <wp:effectExtent l="0" t="0" r="0" b="0"/>
+                <wp:docPr id="1627488302" name="Rectangle 21"/>
+                <wp:cNvGraphicFramePr>
+                  <a:graphicFrameLocks xmlns:a="http://schemas.openxmlformats.org/drawingml/2006/main" noChangeAspect="1"/>
+                </wp:cNvGraphicFramePr>
+                <a:graphic xmlns:a="http://schemas.openxmlformats.org/drawingml/2006/main">
+                  <a:graphicData uri="http://schemas.microsoft.com/office/word/2010/wordprocessingShape">
+                    <wps:wsp>
+                      <wps:cNvSpPr>
+                        <a:spLocks noChangeAspect="1" noChangeArrowheads="1"/>
+                      </wps:cNvSpPr>
+                      <wps:spPr bwMode="auto">
+                        <a:xfrm>
+                          <a:off x="0" y="0"/>
+                          <a:ext cx="304800" cy="304800"/>
+                        </a:xfrm>
+                        <a:prstGeom prst="rect">
+                          <a:avLst/>
+                        </a:prstGeom>
+                        <a:noFill/>
+                        <a:ln>
+                          <a:noFill/>
+                        </a:ln>
+                        <a:extLst>
+                          <a:ext uri="{909E8E84-426E-40DD-AFC4-6F175D3DCCD1}">
+                            <a14:hiddenFill xmlns:a14="http://schemas.microsoft.com/office/drawing/2010/main">
+                              <a:solidFill>
+                                <a:srgbClr val="FFFFFF"/>
+                              </a:solidFill>
+                            </a14:hiddenFill>
+                          </a:ext>
+                          <a:ext uri="{91240B29-F687-4F45-9708-019B960494DF}">
+                            <a14:hiddenLine xmlns:a14="http://schemas.microsoft.com/office/drawing/2010/main" w="9525">
+                              <a:solidFill>
+                                <a:srgbClr val="000000"/>
+                              </a:solidFill>
+                              <a:miter lim="800000"/>
+                              <a:headEnd/>
+                              <a:tailEnd/>
+                            </a14:hiddenLine>
+                          </a:ext>
+                        </a:extLst>
+                      </wps:spPr>
+                      <wps:bodyPr rot="0" vert="horz" wrap="square" lIns="91440" tIns="45720" rIns="91440" bIns="45720" anchor="t" anchorCtr="0" upright="1">
+                        <a:noAutofit/>
+                      </wps:bodyPr>
+                    </wps:wsp>
+                  </a:graphicData>
+                </a:graphic>
+              </wp:inline>
+            </w:drawing>
+          </mc:Choice>
+          <mc:Fallback>
+            <w:pict>
+              <v:rect w14:anchorId="1B198B2D" id="Rectangle 21" o:spid="_x0000_s1026" style="width:24pt;height:24pt;visibility:visible;mso-wrap-style:square;mso-left-percent:-10001;mso-top-percent:-10001;mso-position-horizontal:absolute;mso-position-horizontal-relative:char;mso-position-vertical:absolute;mso-position-vertical-relative:line;mso-left-percent:-10001;mso-top-percent:-10001;v-text-anchor:top" o:gfxdata="UEsDBBQABgAIAAAAIQC2gziS/gAAAOEBAAATAAAAW0NvbnRlbnRfVHlwZXNdLnhtbJSRQU7DMBBF&#10;90jcwfIWJU67QAgl6YK0S0CoHGBkTxKLZGx5TGhvj5O2G0SRWNoz/78nu9wcxkFMGNg6quQqL6RA&#10;0s5Y6ir5vt9lD1JwBDIwOMJKHpHlpr69KfdHjyxSmriSfYz+USnWPY7AufNIadK6MEJMx9ApD/oD&#10;OlTrorhX2lFEilmcO2RdNtjC5xDF9pCuTyYBB5bi6bQ4syoJ3g9WQ0ymaiLzg5KdCXlKLjvcW893&#10;SUOqXwnz5DrgnHtJTxOsQfEKIT7DmDSUCaxw7Rqn8787ZsmRM9e2VmPeBN4uqYvTtW7jvijg9N/y&#10;JsXecLq0q+WD6m8AAAD//wMAUEsDBBQABgAIAAAAIQA4/SH/1gAAAJQBAAALAAAAX3JlbHMvLnJl&#10;bHOkkMFqwzAMhu+DvYPRfXGawxijTi+j0GvpHsDYimMaW0Yy2fr2M4PBMnrbUb/Q94l/f/hMi1qR&#10;JVI2sOt6UJgd+ZiDgffL8ekFlFSbvV0oo4EbChzGx4f9GRdb25HMsYhqlCwG5lrLq9biZkxWOiqY&#10;22YiTra2kYMu1l1tQD30/bPm3wwYN0x18gb45AdQl1tp5j/sFB2T0FQ7R0nTNEV3j6o9feQzro1i&#10;OWA14Fm+Q8a1a8+Bvu/d/dMb2JY5uiPbhG/ktn4cqGU/er3pcvwCAAD//wMAUEsDBBQABgAIAAAA&#10;IQDuEevW0gEAAJ4DAAAOAAAAZHJzL2Uyb0RvYy54bWysU9uO0zAQfUfiHyy/06SlwBI1Xa12tQhp&#10;YZEWPsB17MQi8ZgZt2n5esZOty3whnix5uKcOXN8srreD73YGSQHvpbzWSmF8Roa59tafvt6/+pK&#10;CorKN6oHb2p5MCSv1y9frMZQmQV00DcGBYN4qsZQyy7GUBUF6c4MimYQjOemBRxU5BTbokE1MvrQ&#10;F4uyfFuMgE1A0IaIq3dTU64zvrVGx0dryUTR15K5xXxiPjfpLNYrVbWoQuf0kYb6BxaDcp6HnqDu&#10;VFRii+4vqMFpBAIbZxqGAqx12uQdeJt5+cc2T50KJu/C4lA4yUT/D1Z/3j2FL5ioU3gA/Z2Eh9tO&#10;+dbcUGD5+FHluYQIY2dUwwzmSbtiDFSdMFJCjCY24ydo+LXVNkKWZW9xSDN4YbHP6h9O6pt9FJqL&#10;r8vlVclvpLl1jNMEVT1/HJDiBwODSEEtkdllcLV7oDhdfb6SZnm4d32fH7j3vxUYM1Uy+cQ3uYWq&#10;DTQH5o4wmYRNzUEH+FOKkQ1SS/qxVWik6D963v/9fLlMjsrJ8s27BSd42dlcdpTXDFXLKMUU3sbJ&#10;hduAru2yzBPHG9bMurzPmdWRLJsgK3I0bHLZZZ5vnX+r9S8AAAD//wMAUEsDBBQABgAIAAAAIQBM&#10;oOks2AAAAAMBAAAPAAAAZHJzL2Rvd25yZXYueG1sTI9BS8NAEIXvgv9hGcGL2I0iUmI2RQpiEaGY&#10;as/T7JgEs7NpdpvEf9+pHvQyw+MNb76XLSbXqoH60Hg2cDNLQBGX3jZcGXjfPF3PQYWIbLH1TAa+&#10;KcAiPz/LMLV+5DcailgpCeGQooE6xi7VOpQ1OQwz3xGL9+l7h1FkX2nb4yjhrtW3SXKvHTYsH2rs&#10;aFlT+VUcnIGxXA/bzeuzXl9tV573q/2y+Hgx5vJienwAFWmKf8dwwhd0yIVp5w9sg2oNSJH4M8W7&#10;m4va/W6dZ/o/e34EAAD//wMAUEsBAi0AFAAGAAgAAAAhALaDOJL+AAAA4QEAABMAAAAAAAAAAAAA&#10;AAAAAAAAAFtDb250ZW50X1R5cGVzXS54bWxQSwECLQAUAAYACAAAACEAOP0h/9YAAACUAQAACwAA&#10;AAAAAAAAAAAAAAAvAQAAX3JlbHMvLnJlbHNQSwECLQAUAAYACAAAACEA7hHr1tIBAACeAwAADgAA&#10;AAAAAAAAAAAAAAAuAgAAZHJzL2Uyb0RvYy54bWxQSwECLQAUAAYACAAAACEATKDpLNgAAAADAQAA&#10;DwAAAAAAAAAAAAAAAAAsBAAAZHJzL2Rvd25yZXYueG1sUEsFBgAAAAAEAAQA8wAAADEFAAAAAA==&#10;" filled="f" stroked="f">
+                <o:lock v:ext="edit" aspectratio="t"/>
+                <w10:anchorlock/>
+              </v:rect>
+            </w:pict>
+          </mc:Fallback>
+        </mc:AlternateContent>
+      </w:r>
+      <w:r>
+        <w:rPr>
+          <w:noProof/>
+        </w:rPr>
+        <w:drawing>
+          <wp:inline distT="0" distB="0" distL="0" distR="0" wp14:anchorId="76486EF4" wp14:editId="2F68FED4">
+            <wp:extent cx="2847975" cy="2135981"/>
+            <wp:effectExtent l="0" t="0" r="0" b="0"/>
+            <wp:docPr id="1625779411" name="Picture 22"/>
+            <wp:cNvGraphicFramePr>
+              <a:graphicFrameLocks xmlns:a="http://schemas.openxmlformats.org/drawingml/2006/main" noChangeAspect="1"/>
+            </wp:cNvGraphicFramePr>
+            <a:graphic xmlns:a="http://schemas.openxmlformats.org/drawingml/2006/main">
+              <a:graphicData uri="http://schemas.openxmlformats.org/drawingml/2006/picture">
+                <pic:pic xmlns:pic="http://schemas.openxmlformats.org/drawingml/2006/picture">
+                  <pic:nvPicPr>
+                    <pic:cNvPr id="0" name="Picture 2"/>
+                    <pic:cNvPicPr>
+                      <a:picLocks noChangeAspect="1" noChangeArrowheads="1"/>
+                    </pic:cNvPicPr>
+                  </pic:nvPicPr>
+                  <pic:blipFill>
+                    <a:blip r:embed="rId15" cstate="print">
+                      <a:extLst>
+                        <a:ext uri="{28A0092B-C50C-407E-A947-70E740481C1C}">
+                          <a14:useLocalDpi xmlns:a14="http://schemas.microsoft.com/office/drawing/2010/main" val="0"/>
+                        </a:ext>
+                      </a:extLst>
+                    </a:blip>
+                    <a:srcRect/>
+                    <a:stretch>
+                      <a:fillRect/>
+                    </a:stretch>
+                  </pic:blipFill>
+                  <pic:spPr bwMode="auto">
+                    <a:xfrm>
+                      <a:off x="0" y="0"/>
+                      <a:ext cx="2853375" cy="2140031"/>
+                    </a:xfrm>
+                    <a:prstGeom prst="rect">
+                      <a:avLst/>
+                    </a:prstGeom>
+                    <a:noFill/>
+                  </pic:spPr>
+                </pic:pic>
+              </a:graphicData>
+            </a:graphic>
+          </wp:inline>
+        </w:drawing>
+      </w:r>
+    </w:p>
+    <w:p>
+      <w:pPr>
+        <w:jc w:val="both"/>
+      </w:pPr>
+    </w:p>
+    <w:p>
+      <w:pPr>
+        <w:jc w:val="both"/>
+      </w:pPr>
+      <w:r>
+        <w:tab/>
+      </w:r>
+    </w:p>
+    <w:p>
+      <w:pPr>
+        <w:jc w:val="both"/>
+      </w:pPr>
+    </w:p>
+    <w:p>
+      <w:pPr>
+        <w:jc w:val="both"/>
+      </w:pPr>
+    </w:p>
+    <w:p>
+      <w:pPr>
+        <w:jc w:val="both"/>
+      </w:pPr>
+    </w:p>
+    <w:p>
+      <w:pPr>
+        <w:jc w:val="both"/>
+      </w:pPr>
+    </w:p>
+    <w:p>
+      <w:pPr>
+        <w:jc w:val="both"/>
+      </w:pPr>
+    </w:p>
+    <w:p>
+      <w:pPr>
+        <w:jc w:val="both"/>
+      </w:pPr>
+    </w:p>
+    <w:p>
+      <w:pPr>
+        <w:jc w:val="both"/>
+      </w:pPr>
+    </w:p>
+    <w:p>
+      <w:pPr>
+        <w:jc w:val="both"/>
+      </w:pPr>
+    </w:p>
+    <w:p>
+      <w:pPr>
+        <w:jc w:val="both"/>
+      </w:pPr>
+    </w:p>
+    <w:p>
+      <w:pPr>
+        <w:jc w:val="both"/>
+      </w:pPr>
+    </w:p>
+    <w:p>
+      <w:pPr>
+        <w:jc w:val="both"/>
+      </w:pPr>
+    </w:p>
+    <w:p>
+      <w:pPr>
+        <w:jc w:val="both"/>
+      </w:pPr>
+    </w:p>
+    <w:p>
+      <w:pPr>
+        <w:jc w:val="both"/>
+      </w:pPr>
+      <w:r>
+        <w:t>//parameter [7:0] bin = 8'd042</w:t>
+      </w:r>
+    </w:p>
+    <w:p>
+      <w:pPr>
+        <w:jc w:val="both"/>
+      </w:pPr>
+    </w:p>
+    <w:p>
+      <w:pPr>
+        <w:jc w:val="center"/>
+      </w:pPr>
+      <w:r>
+        <w:rPr>
+          <w:noProof/>
+        </w:rPr>
+        <w:drawing>
+          <wp:inline distT="0" distB="0" distL="0" distR="0" wp14:anchorId="298BED17" wp14:editId="787158CF">
+            <wp:extent cx="3190875" cy="2393156"/>
+            <wp:effectExtent l="0" t="0" r="0" b="7620"/>
+            <wp:docPr id="206764575" name="Picture 26"/>
+            <wp:cNvGraphicFramePr>
+              <a:graphicFrameLocks xmlns:a="http://schemas.openxmlformats.org/drawingml/2006/main" noChangeAspect="1"/>
+            </wp:cNvGraphicFramePr>
+            <a:graphic xmlns:a="http://schemas.openxmlformats.org/drawingml/2006/main">
+              <a:graphicData uri="http://schemas.openxmlformats.org/drawingml/2006/picture">
+                <pic:pic xmlns:pic="http://schemas.openxmlformats.org/drawingml/2006/picture">
+                  <pic:nvPicPr>
+                    <pic:cNvPr id="0" name="Picture 6"/>
+                    <pic:cNvPicPr>
+                      <a:picLocks noChangeAspect="1" noChangeArrowheads="1"/>
+                    </pic:cNvPicPr>
+                  </pic:nvPicPr>
+                  <pic:blipFill>
+                    <a:blip r:embed="rId16" cstate="print">
+                      <a:extLst>
+                        <a:ext uri="{28A0092B-C50C-407E-A947-70E740481C1C}">
+                          <a14:useLocalDpi xmlns:a14="http://schemas.microsoft.com/office/drawing/2010/main" val="0"/>
+                        </a:ext>
+                      </a:extLst>
+                    </a:blip>
+                    <a:srcRect/>
+                    <a:stretch>
+                      <a:fillRect/>
+                    </a:stretch>
+                  </pic:blipFill>
+                  <pic:spPr bwMode="auto">
+                    <a:xfrm>
+                      <a:off x="0" y="0"/>
+                      <a:ext cx="3200776" cy="2400581"/>
+                    </a:xfrm>
+                    <a:prstGeom prst="rect">
+                      <a:avLst/>
+                    </a:prstGeom>
+                    <a:noFill/>
+                  </pic:spPr>
+                </pic:pic>
+              </a:graphicData>
+            </a:graphic>
+          </wp:inline>
+        </w:drawing>
+      </w:r>
+    </w:p>
+    <w:p>
+      <w:pPr>
+        <w:jc w:val="both"/>
+      </w:pPr>
+      <w:r>
+        <w:tab/>
+        <w:t>//parameter [7:0] bin = 8'd064</w:t>
+      </w:r>
+    </w:p>
+    <w:p>
+      <w:pPr>
+        <w:jc w:val="center"/>
+      </w:pPr>
+      <w:r>
+        <w:rPr>
+          <w:noProof/>
+        </w:rPr>
+        <w:drawing>
+          <wp:inline distT="0" distB="0" distL="0" distR="0" wp14:anchorId="69486C31" wp14:editId="0B9BF0CB">
+            <wp:extent cx="3371850" cy="2528886"/>
+            <wp:effectExtent l="0" t="0" r="0" b="5080"/>
+            <wp:docPr id="887510430" name="Picture 25"/>
+            <wp:cNvGraphicFramePr>
+              <a:graphicFrameLocks xmlns:a="http://schemas.openxmlformats.org/drawingml/2006/main" noChangeAspect="1"/>
+            </wp:cNvGraphicFramePr>
+            <a:graphic xmlns:a="http://schemas.openxmlformats.org/drawingml/2006/main">
+              <a:graphicData uri="http://schemas.openxmlformats.org/drawingml/2006/picture">
+                <pic:pic xmlns:pic="http://schemas.openxmlformats.org/drawingml/2006/picture">
+                  <pic:nvPicPr>
+                    <pic:cNvPr id="0" name="Picture 5"/>
+                    <pic:cNvPicPr>
+                      <a:picLocks noChangeAspect="1" noChangeArrowheads="1"/>
+                    </pic:cNvPicPr>
+                  </pic:nvPicPr>
+                  <pic:blipFill>
+                    <a:blip r:embed="rId17" cstate="print">
+                      <a:extLst>
+                        <a:ext uri="{28A0092B-C50C-407E-A947-70E740481C1C}">
+                          <a14:useLocalDpi xmlns:a14="http://schemas.microsoft.com/office/drawing/2010/main" val="0"/>
+                        </a:ext>
+                      </a:extLst>
+                    </a:blip>
+                    <a:srcRect/>
+                    <a:stretch>
+                      <a:fillRect/>
+                    </a:stretch>
+                  </pic:blipFill>
+                  <pic:spPr bwMode="auto">
+                    <a:xfrm>
+                      <a:off x="0" y="0"/>
+                      <a:ext cx="3394242" cy="2545680"/>
+                    </a:xfrm>
+                    <a:prstGeom prst="rect">
+                      <a:avLst/>
+                    </a:prstGeom>
+                    <a:noFill/>
+                  </pic:spPr>
+                </pic:pic>
+              </a:graphicData>
+            </a:graphic>
+          </wp:inline>
+        </w:drawing>
+      </w:r>
+    </w:p>
+    <w:p>
+      <w:pPr>
+        <w:jc w:val="both"/>
+      </w:pPr>
+      <w:r>
+        <w:tab/>
+        <w:t>//parameter [7:0] bin = 8'd144</w:t>
+      </w:r>
+    </w:p>
+    <w:p>
+      <w:pPr>
+        <w:jc w:val="center"/>
+      </w:pPr>
+      <w:r>
+        <w:rPr>
+          <w:noProof/>
+        </w:rPr>
+        <w:drawing>
+          <wp:inline distT="0" distB="0" distL="0" distR="0" wp14:anchorId="470516F6" wp14:editId="7BD3E8EE">
+            <wp:extent cx="3352800" cy="2514600"/>
+            <wp:effectExtent l="0" t="0" r="0" b="0"/>
+            <wp:docPr id="386189085" name="Picture 24"/>
+            <wp:cNvGraphicFramePr>
+              <a:graphicFrameLocks xmlns:a="http://schemas.openxmlformats.org/drawingml/2006/main" noChangeAspect="1"/>
+            </wp:cNvGraphicFramePr>
+            <a:graphic xmlns:a="http://schemas.openxmlformats.org/drawingml/2006/main">
+              <a:graphicData uri="http://schemas.openxmlformats.org/drawingml/2006/picture">
+                <pic:pic xmlns:pic="http://schemas.openxmlformats.org/drawingml/2006/picture">
+                  <pic:nvPicPr>
+                    <pic:cNvPr id="0" name="Picture 4"/>
+                    <pic:cNvPicPr>
+                      <a:picLocks noChangeAspect="1" noChangeArrowheads="1"/>
+                    </pic:cNvPicPr>
+                  </pic:nvPicPr>
+                  <pic:blipFill>
+                    <a:blip r:embed="rId18" cstate="print">
+                      <a:extLst>
+                        <a:ext uri="{28A0092B-C50C-407E-A947-70E740481C1C}">
+                          <a14:useLocalDpi xmlns:a14="http://schemas.microsoft.com/office/drawing/2010/main" val="0"/>
+                        </a:ext>
+                      </a:extLst>
+                    </a:blip>
+                    <a:srcRect/>
+                    <a:stretch>
+                      <a:fillRect/>
+                    </a:stretch>
+                  </pic:blipFill>
+                  <pic:spPr bwMode="auto">
+                    <a:xfrm>
+                      <a:off x="0" y="0"/>
+                      <a:ext cx="3356299" cy="2517224"/>
+                    </a:xfrm>
+                    <a:prstGeom prst="rect">
+                      <a:avLst/>
+                    </a:prstGeom>
+                    <a:noFill/>
+                  </pic:spPr>
+                </pic:pic>
+              </a:graphicData>
+            </a:graphic>
+          </wp:inline>
+        </w:drawing>
+      </w:r>
+    </w:p>
+    <w:p>
+      <w:pPr>
+        <w:jc w:val="both"/>
+      </w:pPr>
+      <w:r>
+        <w:lastRenderedPageBreak/>
+        <w:tab/>
+        <w:t>//parameter [7:0] bin = 8'd164</w:t>
+      </w:r>
+    </w:p>
+    <w:p>
+      <w:pPr>
+        <w:tabs>
+          <w:tab w:val="left" w:pos="2820"/>
+        </w:tabs>
+        <w:jc w:val="both"/>
+      </w:pPr>
+      <w:r>
+        <w:tab/>
+      </w:r>
+      <w:r>
+        <w:rPr>
+          <w:noProof/>
+        </w:rPr>
+        <w:drawing>
+          <wp:inline distT="0" distB="0" distL="0" distR="0" wp14:anchorId="082D3B04" wp14:editId="0C643863">
+            <wp:extent cx="3594100" cy="2695575"/>
+            <wp:effectExtent l="0" t="0" r="6350" b="9525"/>
+            <wp:docPr id="1106482363" name="Picture 23"/>
+            <wp:cNvGraphicFramePr>
+              <a:graphicFrameLocks xmlns:a="http://schemas.openxmlformats.org/drawingml/2006/main" noChangeAspect="1"/>
+            </wp:cNvGraphicFramePr>
+            <a:graphic xmlns:a="http://schemas.openxmlformats.org/drawingml/2006/main">
+              <a:graphicData uri="http://schemas.openxmlformats.org/drawingml/2006/picture">
+                <pic:pic xmlns:pic="http://schemas.openxmlformats.org/drawingml/2006/picture">
+                  <pic:nvPicPr>
+                    <pic:cNvPr id="0" name="Picture 3"/>
+                    <pic:cNvPicPr>
+                      <a:picLocks noChangeAspect="1" noChangeArrowheads="1"/>
+                    </pic:cNvPicPr>
+                  </pic:nvPicPr>
+                  <pic:blipFill>
+                    <a:blip r:embed="rId19" cstate="print">
+                      <a:extLst>
+                        <a:ext uri="{28A0092B-C50C-407E-A947-70E740481C1C}">
+                          <a14:useLocalDpi xmlns:a14="http://schemas.microsoft.com/office/drawing/2010/main" val="0"/>
+                        </a:ext>
+                      </a:extLst>
+                    </a:blip>
+                    <a:srcRect/>
+                    <a:stretch>
+                      <a:fillRect/>
+                    </a:stretch>
+                  </pic:blipFill>
+                  <pic:spPr bwMode="auto">
+                    <a:xfrm>
+                      <a:off x="0" y="0"/>
+                      <a:ext cx="3599815" cy="2699861"/>
+                    </a:xfrm>
+                    <a:prstGeom prst="rect">
+                      <a:avLst/>
+                    </a:prstGeom>
+                    <a:noFill/>
+                  </pic:spPr>
+                </pic:pic>
+              </a:graphicData>
+            </a:graphic>
+          </wp:inline>
+        </w:drawing>
+      </w:r>
+    </w:p>
+    <w:p>
+      <w:pPr>
+        <w:jc w:val="both"/>
+      </w:pPr>
+      <w:r>
+        <w:tab/>
+        <w:t>//parameter [7:0] bin = 8'd255</w:t>
+      </w:r>
+    </w:p>
+    <w:p>
+      <w:pPr>
+        <w:jc w:val="center"/>
+      </w:pPr>
+      <w:r>
+        <w:rPr>
+          <w:noProof/>
+        </w:rPr>
+        <w:drawing>
+          <wp:inline distT="0" distB="0" distL="0" distR="0" wp14:anchorId="495DEB39" wp14:editId="7D504B43">
+            <wp:extent cx="4038388" cy="3028791"/>
+            <wp:effectExtent l="0" t="0" r="635" b="635"/>
+            <wp:docPr id="1791001217" name="Picture 28"/>
+            <wp:cNvGraphicFramePr>
+              <a:graphicFrameLocks xmlns:a="http://schemas.openxmlformats.org/drawingml/2006/main" noChangeAspect="1"/>
+            </wp:cNvGraphicFramePr>
+            <a:graphic xmlns:a="http://schemas.openxmlformats.org/drawingml/2006/main">
+              <a:graphicData uri="http://schemas.openxmlformats.org/drawingml/2006/picture">
+                <pic:pic xmlns:pic="http://schemas.openxmlformats.org/drawingml/2006/picture">
+                  <pic:nvPicPr>
+                    <pic:cNvPr id="0" name="Picture 7"/>
+                    <pic:cNvPicPr>
+                      <a:picLocks noChangeAspect="1" noChangeArrowheads="1"/>
+                    </pic:cNvPicPr>
+                  </pic:nvPicPr>
+                  <pic:blipFill>
+                    <a:blip r:embed="rId20" cstate="print">
+                      <a:extLst>
+                        <a:ext uri="{28A0092B-C50C-407E-A947-70E740481C1C}">
+                          <a14:useLocalDpi xmlns:a14="http://schemas.microsoft.com/office/drawing/2010/main" val="0"/>
+                        </a:ext>
+                      </a:extLst>
+                    </a:blip>
+                    <a:srcRect/>
+                    <a:stretch>
+                      <a:fillRect/>
+                    </a:stretch>
+                  </pic:blipFill>
+                  <pic:spPr bwMode="auto">
+                    <a:xfrm>
+                      <a:off x="0" y="0"/>
+                      <a:ext cx="4046733" cy="3035050"/>
+                    </a:xfrm>
+                    <a:prstGeom prst="rect">
+                      <a:avLst/>
+                    </a:prstGeom>
+                    <a:noFill/>
+                  </pic:spPr>
+                </pic:pic>
+              </a:graphicData>
+            </a:graphic>
+          </wp:inline>
+        </w:drawing>
+      </w:r>
+    </w:p>
     <w:sectPr>
-      <w:headerReference w:type="default" r:id="rId13"/>
-      <w:footerReference w:type="default" r:id="rId14"/>
+      <w:headerReference w:type="default" r:id="rId21"/>
+      <w:footerReference w:type="default" r:id="rId22"/>
       <w:pgSz w:w="12240" w:h="15840"/>
       <w:pgMar w:top="431" w:right="284" w:bottom="431" w:left="680" w:header="0" w:footer="340" w:gutter="0"/>
       <w:cols w:space="720"/>
@@ -3927,30 +4544,8 @@
       <w:rPr>
         <w:rFonts w:ascii="Calibri" w:hAnsi="Calibri" w:cs="Calibri"/>
       </w:rPr>
-      <w:t xml:space="preserve">Ingeniería </w:t>
+      <w:t>Ingeniería en Electrónica</w:t>
     </w:r>
-    <w:proofErr w:type="spellStart"/>
-    <w:r>
-      <w:rPr>
-        <w:rFonts w:ascii="Calibri" w:hAnsi="Calibri" w:cs="Calibri"/>
-      </w:rPr>
-      <w:t>en</w:t>
-    </w:r>
-    <w:proofErr w:type="spellEnd"/>
-    <w:r>
-      <w:rPr>
-        <w:rFonts w:ascii="Calibri" w:hAnsi="Calibri" w:cs="Calibri"/>
-      </w:rPr>
-      <w:t xml:space="preserve"> </w:t>
-    </w:r>
-    <w:proofErr w:type="spellStart"/>
-    <w:r>
-      <w:rPr>
-        <w:rFonts w:ascii="Calibri" w:hAnsi="Calibri" w:cs="Calibri"/>
-      </w:rPr>
-      <w:t>Electrónica</w:t>
-    </w:r>
-    <w:proofErr w:type="spellEnd"/>
   </w:p>
   <w:p>
     <w:pPr>

</xml_diff>